<commit_message>
docs: enfocar propuesta MARKINT en valor antes de la inversion
</commit_message>
<xml_diff>
--- a/docs/presentaciones/safe-zone-peru/propuesta-markint/Safe_Zone_Peru_MARKINT_Propuesta.docx
+++ b/docs/presentaciones/safe-zone-peru/propuesta-markint/Safe_Zone_Peru_MARKINT_Propuesta.docx
@@ -43,9 +43,9 @@
         <w:pStyle w:val="Title"/>
       </w:pPr>
       <w:r>
-        <w:t>Propuesta técnica</w:t>
+        <w:t>La gestión de su equipo,</w:t>
         <w:br/>
-        <w:t>y comercial</w:t>
+        <w:t>diseñada para MARKINT</w:t>
       </w:r>
     </w:p>
     <w:p>
@@ -53,7 +53,7 @@
         <w:pStyle w:val="Subtitle"/>
       </w:pPr>
       <w:r>
-        <w:t>Sistema Integral de Gestión de RRHH para MARKINT</w:t>
+        <w:t>Propuesta de una plataforma propia de Recursos Humanos</w:t>
       </w:r>
     </w:p>
     <w:p>
@@ -70,232 +70,71 @@
         <w:pStyle w:val="Heading2"/>
       </w:pPr>
       <w:r>
-        <w:t>Resumen ejecutivo</w:t>
+        <w:t>Una solución alineada a su forma de trabajar</w:t>
       </w:r>
     </w:p>
     <w:p>
       <w:r>
-        <w:t>Safe Zone Perú propone el desarrollo e implementación desde cero de una plataforma web a medida para centralizar la administración del personal de MARKINT. La solución automatizará el control de asistencia, las solicitudes administrativas y el cálculo base de planillas; incorporará la recepción de boletas con firma electrónica por trazo táctil, la comunicación interna y las encuestas de clima laboral.</w:t>
+        <w:t>MARKINT ya utiliza Buk para la gestión de Recursos Humanos. Partiendo de esa experiencia, Safe Zone Perú propone diseñar y desarrollar una plataforma propia que responda a los procesos, responsabilidades y necesidades que MARKINT defina para su organización.</w:t>
       </w:r>
     </w:p>
     <w:p>
       <w:r>
-        <w:t>Los procesos se conectarán mediante perfiles de acceso diferenciados, para que colaboradores, jefaturas y Recursos Humanos cuenten con la información y las funciones correspondientes a sus responsabilidades.</w:t>
+        <w:t>La propuesta reúne la administración del personal, la asistencia, las solicitudes, la planilla y los documentos en una experiencia conectada. Los colaboradores podrán participar en sus trámites y recibir comunicaciones; las jefaturas y Recursos Humanos contarán con herramientas para revisar, aprobar y consultar información según sus responsabilidades.</w:t>
       </w:r>
     </w:p>
-    <w:tbl>
-      <w:tblPr>
-        <w:tblStyle w:val="LightShading-Accent1"/>
-        <w:tblW w:type="auto" w:w="0"/>
-        <w:tblLook w:firstColumn="1" w:firstRow="1" w:lastColumn="0" w:lastRow="0" w:noHBand="0" w:noVBand="1" w:val="04A0"/>
-      </w:tblPr>
-      <w:tblGrid>
-        <w:gridCol w:w="4876"/>
-        <w:gridCol w:w="4876"/>
-      </w:tblGrid>
-      <w:tr>
-        <w:trPr>
-          <w:cantSplit/>
-        </w:trPr>
-        <w:tc>
-          <w:tcPr>
-            <w:tcW w:type="dxa" w:w="4876"/>
-            <w:shd w:fill="10283F"/>
-          </w:tcPr>
-          <w:p>
-            <w:pPr>
-              <w:spacing w:after="120"/>
-            </w:pPr>
-            <w:r>
-              <w:rPr>
-                <w:b/>
-                <w:color w:val="FFFFFF"/>
-                <w:sz w:val="19"/>
-              </w:rPr>
-              <w:t>Propuesta</w:t>
-            </w:r>
-          </w:p>
-        </w:tc>
-        <w:tc>
-          <w:tcPr>
-            <w:tcW w:type="dxa" w:w="4876"/>
-            <w:shd w:fill="10283F"/>
-          </w:tcPr>
-          <w:p>
-            <w:pPr>
-              <w:spacing w:after="120"/>
-            </w:pPr>
-            <w:r>
-              <w:rPr>
-                <w:b/>
-                <w:color w:val="FFFFFF"/>
-                <w:sz w:val="19"/>
-              </w:rPr>
-              <w:t>Condición</w:t>
-            </w:r>
-          </w:p>
-        </w:tc>
-      </w:tr>
-      <w:tr>
-        <w:trPr>
-          <w:cantSplit/>
-        </w:trPr>
-        <w:tc>
-          <w:tcPr>
-            <w:tcW w:type="dxa" w:w="4876"/>
-          </w:tcPr>
-          <w:p>
-            <w:pPr>
-              <w:spacing w:after="120"/>
-            </w:pPr>
-            <w:r>
-              <w:rPr>
-                <w:sz w:val="19"/>
-              </w:rPr>
-              <w:t>Inversión total del desarrollo</w:t>
-            </w:r>
-          </w:p>
-        </w:tc>
-        <w:tc>
-          <w:tcPr>
-            <w:tcW w:type="dxa" w:w="4876"/>
-          </w:tcPr>
-          <w:p>
-            <w:pPr>
-              <w:spacing w:after="120"/>
-            </w:pPr>
-            <w:r>
-              <w:rPr>
-                <w:sz w:val="19"/>
-              </w:rPr>
-              <w:t>S/ 3,500.00 PEN · monto fijo</w:t>
-            </w:r>
-          </w:p>
-        </w:tc>
-      </w:tr>
-      <w:tr>
-        <w:trPr>
-          <w:cantSplit/>
-        </w:trPr>
-        <w:tc>
-          <w:tcPr>
-            <w:tcW w:type="dxa" w:w="4876"/>
-          </w:tcPr>
-          <w:p>
-            <w:pPr>
-              <w:spacing w:after="120"/>
-            </w:pPr>
-            <w:r>
-              <w:rPr>
-                <w:sz w:val="19"/>
-              </w:rPr>
-              <w:t>Plazo estimado</w:t>
-            </w:r>
-          </w:p>
-        </w:tc>
-        <w:tc>
-          <w:tcPr>
-            <w:tcW w:type="dxa" w:w="4876"/>
-          </w:tcPr>
-          <w:p>
-            <w:pPr>
-              <w:spacing w:after="120"/>
-            </w:pPr>
-            <w:r>
-              <w:rPr>
-                <w:sz w:val="19"/>
-              </w:rPr>
-              <w:t>6 semanas</w:t>
-            </w:r>
-          </w:p>
-        </w:tc>
-      </w:tr>
-      <w:tr>
-        <w:trPr>
-          <w:cantSplit/>
-        </w:trPr>
-        <w:tc>
-          <w:tcPr>
-            <w:tcW w:type="dxa" w:w="4876"/>
-          </w:tcPr>
-          <w:p>
-            <w:pPr>
-              <w:spacing w:after="120"/>
-            </w:pPr>
-            <w:r>
-              <w:rPr>
-                <w:sz w:val="19"/>
-              </w:rPr>
-              <w:t>Garantía posterior a la entrega</w:t>
-            </w:r>
-          </w:p>
-        </w:tc>
-        <w:tc>
-          <w:tcPr>
-            <w:tcW w:type="dxa" w:w="4876"/>
-          </w:tcPr>
-          <w:p>
-            <w:pPr>
-              <w:spacing w:after="120"/>
-            </w:pPr>
-            <w:r>
-              <w:rPr>
-                <w:sz w:val="19"/>
-              </w:rPr>
-              <w:t>60 días calendario</w:t>
-            </w:r>
-          </w:p>
-        </w:tc>
-      </w:tr>
-      <w:tr>
-        <w:trPr>
-          <w:cantSplit/>
-        </w:trPr>
-        <w:tc>
-          <w:tcPr>
-            <w:tcW w:type="dxa" w:w="4876"/>
-          </w:tcPr>
-          <w:p>
-            <w:pPr>
-              <w:spacing w:after="120"/>
-            </w:pPr>
-            <w:r>
-              <w:rPr>
-                <w:sz w:val="19"/>
-              </w:rPr>
-              <w:t>Validez de la propuesta</w:t>
-            </w:r>
-          </w:p>
-        </w:tc>
-        <w:tc>
-          <w:tcPr>
-            <w:tcW w:type="dxa" w:w="4876"/>
-          </w:tcPr>
-          <w:p>
-            <w:pPr>
-              <w:spacing w:after="120"/>
-            </w:pPr>
-            <w:r>
-              <w:rPr>
-                <w:sz w:val="19"/>
-              </w:rPr>
-              <w:t>15 días calendario desde su emisión</w:t>
-            </w:r>
-          </w:p>
-        </w:tc>
-      </w:tr>
-    </w:tbl>
     <w:p>
       <w:pPr>
         <w:pStyle w:val="Heading2"/>
       </w:pPr>
       <w:r>
-        <w:t>Enfoque del servicio</w:t>
+        <w:t>El valor para MARKINT</w:t>
       </w:r>
     </w:p>
     <w:p>
       <w:r>
-        <w:t>Diseño, programación, pruebas, despliegue y capacitación del sistema, con entregas funcionales para revisión del equipo designado por MARKINT.</w:t>
+        <w:rPr>
+          <w:b/>
+        </w:rPr>
+        <w:t xml:space="preserve">Procesos a su medida. </w:t>
+      </w:r>
+      <w:r>
+        <w:t>Flujos de trabajo y permisos definidos según la operación de la empresa.</w:t>
+      </w:r>
+    </w:p>
+    <w:p>
+      <w:r>
+        <w:rPr>
+          <w:b/>
+        </w:rPr>
+        <w:t xml:space="preserve">Información organizada. </w:t>
+      </w:r>
+      <w:r>
+        <w:t>Expedientes, asistencia, planilla y documentos disponibles para los responsables autorizados.</w:t>
+      </w:r>
+    </w:p>
+    <w:p>
+      <w:r>
+        <w:rPr>
+          <w:b/>
+        </w:rPr>
+        <w:t xml:space="preserve">Una mejor experiencia para el equipo. </w:t>
+      </w:r>
+      <w:r>
+        <w:t>Solicitudes en línea, recepción de boletas, encuestas y comunicación interna en una plataforma web.</w:t>
+      </w:r>
+    </w:p>
+    <w:p>
+      <w:pPr>
+        <w:pStyle w:val="Heading2"/>
+      </w:pPr>
+      <w:r>
+        <w:t>Qué proponemos desarrollar</w:t>
+      </w:r>
+    </w:p>
+    <w:p>
+      <w:r>
+        <w:t>Un sistema web a medida, desde el diseño y la programación hasta las pruebas, la puesta en producción y la capacitación del equipo. En las siguientes páginas se detalla su alcance funcional.</w:t>
       </w:r>
     </w:p>
     <w:p>

</xml_diff>

<commit_message>
docs: reescribir propuesta MARKINT con enfoque operativo
</commit_message>
<xml_diff>
--- a/docs/presentaciones/safe-zone-peru/propuesta-markint/Safe_Zone_Peru_MARKINT_Propuesta.docx
+++ b/docs/presentaciones/safe-zone-peru/propuesta-markint/Safe_Zone_Peru_MARKINT_Propuesta.docx
@@ -6,7 +6,7 @@
       <w:r>
         <w:drawing>
           <wp:inline xmlns:a="http://schemas.openxmlformats.org/drawingml/2006/main" xmlns:pic="http://schemas.openxmlformats.org/drawingml/2006/picture">
-            <wp:extent cx="822960" cy="694034"/>
+            <wp:extent cx="521207" cy="439554"/>
             <wp:docPr id="1" name="Picture 1"/>
             <wp:cNvGraphicFramePr>
               <a:graphicFrameLocks noChangeAspect="1"/>
@@ -27,7 +27,7 @@
                   <pic:spPr>
                     <a:xfrm>
                       <a:off x="0" y="0"/>
-                      <a:ext cx="822960" cy="694034"/>
+                      <a:ext cx="521207" cy="439554"/>
                     </a:xfrm>
                     <a:prstGeom prst="rect"/>
                   </pic:spPr>
@@ -43,26 +43,32 @@
         <w:pStyle w:val="Title"/>
       </w:pPr>
       <w:r>
-        <w:t>La gestión de su equipo,</w:t>
+        <w:t>Sistema de Recursos Humanos</w:t>
         <w:br/>
-        <w:t>diseñada para MARKINT</w:t>
-      </w:r>
-    </w:p>
-    <w:p>
-      <w:pPr>
-        <w:pStyle w:val="Subtitle"/>
-      </w:pPr>
-      <w:r>
-        <w:t>Propuesta de una plataforma propia de Recursos Humanos</w:t>
+        <w:t>para MARKINT</w:t>
       </w:r>
     </w:p>
     <w:p>
       <w:r>
-        <w:t>Atención: Dirección / Área de Gestión Humana – MARKINT</w:t>
-        <w:br/>
-        <w:t>Preparado por: Safe Zone Perú</w:t>
-        <w:br/>
-        <w:t>Fecha de emisión: 22 de octubre de 2026</w:t>
+        <w:t>Propuesta de desarrollo presentada por Safe Zone Perú</w:t>
+      </w:r>
+    </w:p>
+    <w:p>
+      <w:r>
+        <w:rPr>
+          <w:b/>
+        </w:rPr>
+        <w:t>Al equipo de Dirección y Gestión Humana de MARKINT:</w:t>
+      </w:r>
+    </w:p>
+    <w:p>
+      <w:r>
+        <w:t>Les proponemos desarrollar un sistema de Recursos Humanos propio para MARKINT. El trabajo comprende el diseño, la programación y la puesta en funcionamiento de los procesos descritos en esta propuesta, junto con la capacitación de las personas que lo utilizarán.</w:t>
+      </w:r>
+    </w:p>
+    <w:p>
+      <w:r>
+        <w:t>Sabemos que actualmente trabajan con Buk. Antes de programar, revisaremos con su equipo los procesos que desean mantener y los ajustes que necesitan. Con esa información acordaremos cómo se registran los datos, quién revisa cada solicitud y qué información debe recibir cada responsable.</w:t>
       </w:r>
     </w:p>
     <w:p>
@@ -70,17 +76,12 @@
         <w:pStyle w:val="Heading2"/>
       </w:pPr>
       <w:r>
-        <w:t>Una solución alineada a su forma de trabajar</w:t>
+        <w:t>Qué podrá hacer el equipo con el sistema</w:t>
       </w:r>
     </w:p>
     <w:p>
       <w:r>
-        <w:t>MARKINT ya utiliza Buk para la gestión de Recursos Humanos. Partiendo de esa experiencia, Safe Zone Perú propone diseñar y desarrollar una plataforma propia que responda a los procesos, responsabilidades y necesidades que MARKINT defina para su organización.</w:t>
-      </w:r>
-    </w:p>
-    <w:p>
-      <w:r>
-        <w:t>La propuesta reúne la administración del personal, la asistencia, las solicitudes, la planilla y los documentos en una experiencia conectada. Los colaboradores podrán participar en sus trámites y recibir comunicaciones; las jefaturas y Recursos Humanos contarán con herramientas para revisar, aprobar y consultar información según sus responsabilidades.</w:t>
+        <w:t>Consultar el expediente de un colaborador, revisar su asistencia, resolver una solicitud y organizar sus documentos desde la misma plataforma. Cada operación tendrá los accesos y las validaciones que se definan con MARKINT.</w:t>
       </w:r>
     </w:p>
     <w:p>
@@ -88,40 +89,12 @@
         <w:pStyle w:val="Heading2"/>
       </w:pPr>
       <w:r>
-        <w:t>El valor para MARKINT</w:t>
+        <w:t>Personal y expediente laboral</w:t>
       </w:r>
     </w:p>
     <w:p>
       <w:r>
-        <w:rPr>
-          <w:b/>
-        </w:rPr>
-        <w:t xml:space="preserve">Procesos a su medida. </w:t>
-      </w:r>
-      <w:r>
-        <w:t>Flujos de trabajo y permisos definidos según la operación de la empresa.</w:t>
-      </w:r>
-    </w:p>
-    <w:p>
-      <w:r>
-        <w:rPr>
-          <w:b/>
-        </w:rPr>
-        <w:t xml:space="preserve">Información organizada. </w:t>
-      </w:r>
-      <w:r>
-        <w:t>Expedientes, asistencia, planilla y documentos disponibles para los responsables autorizados.</w:t>
-      </w:r>
-    </w:p>
-    <w:p>
-      <w:r>
-        <w:rPr>
-          <w:b/>
-        </w:rPr>
-        <w:t xml:space="preserve">Una mejor experiencia para el equipo. </w:t>
-      </w:r>
-      <w:r>
-        <w:t>Solicitudes en línea, recepción de boletas, encuestas y comunicación interna en una plataforma web.</w:t>
+        <w:t>Registro de colaboradores, contratos, cargos, áreas, sedes e historial de movimientos. Recursos Humanos podrá consultar la información y los documentos asociados a cada persona.</w:t>
       </w:r>
     </w:p>
     <w:p>
@@ -129,12 +102,25 @@
         <w:pStyle w:val="Heading2"/>
       </w:pPr>
       <w:r>
-        <w:t>Qué proponemos desarrollar</w:t>
+        <w:t>Horarios, asistencia e incidencias</w:t>
       </w:r>
     </w:p>
     <w:p>
       <w:r>
-        <w:t>Un sistema web a medida, desde el diseño y la programación hasta las pruebas, la puesta en producción y la capacitación del equipo. En las siguientes páginas se detalla su alcance funcional.</w:t>
+        <w:t>Programación de horarios y registro de entradas y salidas. Consulta de tardanzas, horas extra e incidencias, con reportes para la revisión del periodo.</w:t>
+      </w:r>
+    </w:p>
+    <w:p>
+      <w:pPr>
+        <w:pStyle w:val="Heading2"/>
+      </w:pPr>
+      <w:r>
+        <w:t>Vacaciones y licencias</w:t>
+      </w:r>
+    </w:p>
+    <w:p>
+      <w:r>
+        <w:t>El colaborador registra su solicitud en línea; la jefatura o Recursos Humanos la revisa y aprueba o rechaza. La solicitud conserva su estado para que el interesado pueda consultar la respuesta.</w:t>
       </w:r>
     </w:p>
     <w:p>
@@ -147,7 +133,7 @@
         <w:pStyle w:val="Heading1"/>
       </w:pPr>
       <w:r>
-        <w:t>Módulos y funcionalidades</w:t>
+        <w:t>Planilla, documentos y participación</w:t>
       </w:r>
     </w:p>
     <w:p>
@@ -155,12 +141,12 @@
         <w:pStyle w:val="Heading2"/>
       </w:pPr>
       <w:r>
-        <w:t>Expediente digital de personal</w:t>
+        <w:t>Cálculo y revisión de planilla</w:t>
       </w:r>
     </w:p>
     <w:p>
       <w:r>
-        <w:t>Centralización de datos de colaboradores, contratos, cargos, áreas, sedes e historial de movimientos.</w:t>
+        <w:t>Cálculo base y consolidación de haberes, descuentos y beneficios de ley para revisión del responsable contable. Se incluirán reportes y generación de archivos bancarios con el formato que se acuerde con MARKINT. Las reglas y los resultados se validarán con su equipo antes de utilizar el sistema en producción.</w:t>
       </w:r>
     </w:p>
     <w:p>
@@ -168,38 +154,12 @@
         <w:pStyle w:val="Heading2"/>
       </w:pPr>
       <w:r>
-        <w:t>Control de asistencia e incidencias</w:t>
+        <w:t>Boletas y firma de recepción</w:t>
       </w:r>
     </w:p>
     <w:p>
       <w:r>
-        <w:t>Programación de horarios, registro de entradas y salidas, tardanzas, horas extra e incidencias.</w:t>
-      </w:r>
-    </w:p>
-    <w:p>
-      <w:pPr>
-        <w:pStyle w:val="Heading2"/>
-      </w:pPr>
-      <w:r>
-        <w:t>Gestión de vacaciones y licencias</w:t>
-      </w:r>
-    </w:p>
-    <w:p>
-      <w:r>
-        <w:t>Solicitudes en línea por el colaborador y flujos de aprobación o rechazo por jefaturas o Recursos Humanos.</w:t>
-      </w:r>
-    </w:p>
-    <w:p>
-      <w:pPr>
-        <w:pStyle w:val="Heading2"/>
-      </w:pPr>
-      <w:r>
-        <w:t>Planilla y documentos</w:t>
-      </w:r>
-    </w:p>
-    <w:p>
-      <w:r>
-        <w:t>Cálculo y consolidación de haberes, descuentos y beneficios de ley para validación contable; generación de archivos bancarios. Carga y organización de boletas y documentos.</w:t>
+        <w:t>Carga y organización de boletas y documentos. El colaborador podrá firmar la recepción con un trazo en pantalla, desde un dispositivo táctil o con el mouse. La constancia quedará asociada al documento y al usuario, con fecha, hora e IP de acceso.</w:t>
       </w:r>
     </w:p>
     <w:p>
@@ -212,7 +172,7 @@
     </w:p>
     <w:p>
       <w:r>
-        <w:t>Campañas de encuestas segmentadas por áreas o sedes, reglas de confidencialidad y seguimiento de planes de acción.</w:t>
+        <w:t>Creación de campañas dirigidas a las áreas o sedes correspondientes, consulta de resultados y seguimiento de planes de acción. Antes de publicar una encuesta se definirán los destinatarios y las reglas de confidencialidad de sus respuestas.</w:t>
       </w:r>
     </w:p>
     <w:p>
@@ -225,7 +185,7 @@
     </w:p>
     <w:p>
       <w:r>
-        <w:t>Avisos y comunicados segmentados, notificaciones en la plataforma y por correo, y seguimiento de cobertura de lectura.</w:t>
+        <w:t>Publicación de avisos y comunicados para los destinatarios seleccionados, notificaciones dentro del sistema y por correo, y consulta de la cobertura de lectura.</w:t>
       </w:r>
     </w:p>
     <w:p>
@@ -233,12 +193,12 @@
         <w:pStyle w:val="Heading2"/>
       </w:pPr>
       <w:r>
-        <w:t>Seguridad y permisos</w:t>
+        <w:t>Quién tendrá acceso</w:t>
       </w:r>
     </w:p>
     <w:p>
       <w:r>
-        <w:t>Perfiles de acceso diferenciados para Administrador, Recursos Humanos, Jefatura y Empleado.</w:t>
+        <w:t>Se contemplan perfiles de Administrador, Recursos Humanos, Jefatura y Empleado. Los permisos concretos se acordarán por función: consultar información, registrar datos, revisar solicitudes o aprobar operaciones.</w:t>
       </w:r>
     </w:p>
     <w:p>
@@ -246,14 +206,211 @@
         <w:pStyle w:val="Heading2"/>
       </w:pPr>
       <w:r>
-        <w:t>Firma electrónica de recepción por trazo táctil</w:t>
+        <w:t>Plazo de trabajo: seis semanas</w:t>
       </w:r>
     </w:p>
-    <w:p>
-      <w:r>
-        <w:t>El colaborador podrá firmar la recepción de sus boletas mediante un trazo directo en pantalla, usando un dispositivo táctil o el mouse. La constancia se asociará al documento y al usuario, con registro de fecha, hora e IP de acceso para su trazabilidad.</w:t>
-      </w:r>
-    </w:p>
+    <w:tbl>
+      <w:tblPr>
+        <w:tblStyle w:val="LightShading-Accent1"/>
+        <w:tblW w:type="auto" w:w="0"/>
+        <w:tblLook w:firstColumn="1" w:firstRow="1" w:lastColumn="0" w:lastRow="0" w:noHBand="0" w:noVBand="1" w:val="04A0"/>
+      </w:tblPr>
+      <w:tblGrid>
+        <w:gridCol w:w="4933"/>
+        <w:gridCol w:w="4933"/>
+      </w:tblGrid>
+      <w:tr>
+        <w:trPr>
+          <w:cantSplit/>
+        </w:trPr>
+        <w:tc>
+          <w:tcPr>
+            <w:tcW w:type="dxa" w:w="4933"/>
+            <w:shd w:fill="183347"/>
+          </w:tcPr>
+          <w:p>
+            <w:pPr>
+              <w:spacing w:after="100"/>
+            </w:pPr>
+            <w:r>
+              <w:rPr>
+                <w:b/>
+                <w:color w:val="FFFFFF"/>
+                <w:sz w:val="18"/>
+              </w:rPr>
+              <w:t>Periodo</w:t>
+            </w:r>
+          </w:p>
+        </w:tc>
+        <w:tc>
+          <w:tcPr>
+            <w:tcW w:type="dxa" w:w="4933"/>
+            <w:shd w:fill="183347"/>
+          </w:tcPr>
+          <w:p>
+            <w:pPr>
+              <w:spacing w:after="100"/>
+            </w:pPr>
+            <w:r>
+              <w:rPr>
+                <w:b/>
+                <w:color w:val="FFFFFF"/>
+                <w:sz w:val="18"/>
+              </w:rPr>
+              <w:t>Trabajo previsto</w:t>
+            </w:r>
+          </w:p>
+        </w:tc>
+      </w:tr>
+      <w:tr>
+        <w:trPr>
+          <w:cantSplit/>
+        </w:trPr>
+        <w:tc>
+          <w:tcPr>
+            <w:tcW w:type="dxa" w:w="4933"/>
+          </w:tcPr>
+          <w:p>
+            <w:pPr>
+              <w:spacing w:after="100"/>
+            </w:pPr>
+            <w:r>
+              <w:rPr>
+                <w:sz w:val="18"/>
+              </w:rPr>
+              <w:t>Semanas 1 y 2</w:t>
+            </w:r>
+          </w:p>
+        </w:tc>
+        <w:tc>
+          <w:tcPr>
+            <w:tcW w:type="dxa" w:w="4933"/>
+          </w:tcPr>
+          <w:p>
+            <w:pPr>
+              <w:spacing w:after="100"/>
+            </w:pPr>
+            <w:r>
+              <w:rPr>
+                <w:sz w:val="18"/>
+              </w:rPr>
+              <w:t>Revisión de requerimientos, diseño de datos y expediente de personal.</w:t>
+            </w:r>
+          </w:p>
+        </w:tc>
+      </w:tr>
+      <w:tr>
+        <w:trPr>
+          <w:cantSplit/>
+        </w:trPr>
+        <w:tc>
+          <w:tcPr>
+            <w:tcW w:type="dxa" w:w="4933"/>
+          </w:tcPr>
+          <w:p>
+            <w:pPr>
+              <w:spacing w:after="100"/>
+            </w:pPr>
+            <w:r>
+              <w:rPr>
+                <w:sz w:val="18"/>
+              </w:rPr>
+              <w:t>Semanas 3 y 4</w:t>
+            </w:r>
+          </w:p>
+        </w:tc>
+        <w:tc>
+          <w:tcPr>
+            <w:tcW w:type="dxa" w:w="4933"/>
+          </w:tcPr>
+          <w:p>
+            <w:pPr>
+              <w:spacing w:after="100"/>
+            </w:pPr>
+            <w:r>
+              <w:rPr>
+                <w:sz w:val="18"/>
+              </w:rPr>
+              <w:t>Asistencia, vacaciones, cálculo de planilla y reportes.</w:t>
+            </w:r>
+          </w:p>
+        </w:tc>
+      </w:tr>
+      <w:tr>
+        <w:trPr>
+          <w:cantSplit/>
+        </w:trPr>
+        <w:tc>
+          <w:tcPr>
+            <w:tcW w:type="dxa" w:w="4933"/>
+          </w:tcPr>
+          <w:p>
+            <w:pPr>
+              <w:spacing w:after="100"/>
+            </w:pPr>
+            <w:r>
+              <w:rPr>
+                <w:sz w:val="18"/>
+              </w:rPr>
+              <w:t>Semana 5</w:t>
+            </w:r>
+          </w:p>
+        </w:tc>
+        <w:tc>
+          <w:tcPr>
+            <w:tcW w:type="dxa" w:w="4933"/>
+          </w:tcPr>
+          <w:p>
+            <w:pPr>
+              <w:spacing w:after="100"/>
+            </w:pPr>
+            <w:r>
+              <w:rPr>
+                <w:sz w:val="18"/>
+              </w:rPr>
+              <w:t>Firma de recepción, encuestas, comunicación y pruebas de los flujos.</w:t>
+            </w:r>
+          </w:p>
+        </w:tc>
+      </w:tr>
+      <w:tr>
+        <w:trPr>
+          <w:cantSplit/>
+        </w:trPr>
+        <w:tc>
+          <w:tcPr>
+            <w:tcW w:type="dxa" w:w="4933"/>
+          </w:tcPr>
+          <w:p>
+            <w:pPr>
+              <w:spacing w:after="100"/>
+            </w:pPr>
+            <w:r>
+              <w:rPr>
+                <w:sz w:val="18"/>
+              </w:rPr>
+              <w:t>Semana 6</w:t>
+            </w:r>
+          </w:p>
+        </w:tc>
+        <w:tc>
+          <w:tcPr>
+            <w:tcW w:type="dxa" w:w="4933"/>
+          </w:tcPr>
+          <w:p>
+            <w:pPr>
+              <w:spacing w:after="100"/>
+            </w:pPr>
+            <w:r>
+              <w:rPr>
+                <w:sz w:val="18"/>
+              </w:rPr>
+              <w:t>Pruebas integrales, instalación en producción y capacitación.</w:t>
+            </w:r>
+          </w:p>
+        </w:tc>
+      </w:tr>
+    </w:tbl>
     <w:p>
       <w:r>
         <w:br w:type="page"/>
@@ -264,7 +421,7 @@
         <w:pStyle w:val="Heading1"/>
       </w:pPr>
       <w:r>
-        <w:t>Implementación y entrega</w:t>
+        <w:t>Inversión y condiciones de entrega</w:t>
       </w:r>
     </w:p>
     <w:p>
@@ -272,12 +429,21 @@
         <w:pStyle w:val="Heading2"/>
       </w:pPr>
       <w:r>
-        <w:t>Cronograma de trabajo · 6 semanas</w:t>
+        <w:t>Precio del desarrollo</w:t>
       </w:r>
     </w:p>
     <w:p>
       <w:r>
-        <w:t>El proyecto se ejecutará mediante hitos de entrega y revisión funcional con el equipo de MARKINT.</w:t>
+        <w:rPr>
+          <w:b/>
+          <w:sz w:val="52"/>
+        </w:rPr>
+        <w:t>S/ 3,500.00 PEN</w:t>
+      </w:r>
+    </w:p>
+    <w:p>
+      <w:r>
+        <w:t>Monto fijo por el alcance descrito, sin cobro por colaborador.</w:t>
       </w:r>
     </w:p>
     <w:tbl>
@@ -287,8 +453,9 @@
         <w:tblLook w:firstColumn="1" w:firstRow="1" w:lastColumn="0" w:lastRow="0" w:noHBand="0" w:noVBand="1" w:val="04A0"/>
       </w:tblPr>
       <w:tblGrid>
-        <w:gridCol w:w="4876"/>
-        <w:gridCol w:w="4876"/>
+        <w:gridCol w:w="3289"/>
+        <w:gridCol w:w="3289"/>
+        <w:gridCol w:w="3289"/>
       </w:tblGrid>
       <w:tr>
         <w:trPr>
@@ -296,39 +463,58 @@
         </w:trPr>
         <w:tc>
           <w:tcPr>
-            <w:tcW w:type="dxa" w:w="4876"/>
-            <w:shd w:fill="10283F"/>
+            <w:tcW w:type="dxa" w:w="3289"/>
+            <w:shd w:fill="183347"/>
           </w:tcPr>
           <w:p>
             <w:pPr>
-              <w:spacing w:after="120"/>
+              <w:spacing w:after="100"/>
             </w:pPr>
             <w:r>
               <w:rPr>
                 <w:b/>
                 <w:color w:val="FFFFFF"/>
-                <w:sz w:val="19"/>
+                <w:sz w:val="18"/>
               </w:rPr>
-              <w:t>Periodo</w:t>
+              <w:t>Pago</w:t>
             </w:r>
           </w:p>
         </w:tc>
         <w:tc>
           <w:tcPr>
-            <w:tcW w:type="dxa" w:w="4876"/>
-            <w:shd w:fill="10283F"/>
+            <w:tcW w:type="dxa" w:w="3289"/>
+            <w:shd w:fill="183347"/>
           </w:tcPr>
           <w:p>
             <w:pPr>
-              <w:spacing w:after="120"/>
+              <w:spacing w:after="100"/>
             </w:pPr>
             <w:r>
               <w:rPr>
                 <w:b/>
                 <w:color w:val="FFFFFF"/>
-                <w:sz w:val="19"/>
+                <w:sz w:val="18"/>
               </w:rPr>
-              <w:t>Actividades</w:t>
+              <w:t>Importe</w:t>
+            </w:r>
+          </w:p>
+        </w:tc>
+        <w:tc>
+          <w:tcPr>
+            <w:tcW w:type="dxa" w:w="3289"/>
+            <w:shd w:fill="183347"/>
+          </w:tcPr>
+          <w:p>
+            <w:pPr>
+              <w:spacing w:after="100"/>
+            </w:pPr>
+            <w:r>
+              <w:rPr>
+                <w:b/>
+                <w:color w:val="FFFFFF"/>
+                <w:sz w:val="18"/>
+              </w:rPr>
+              <w:t>Momento</w:t>
             </w:r>
           </w:p>
         </w:tc>
@@ -339,33 +525,49 @@
         </w:trPr>
         <w:tc>
           <w:tcPr>
-            <w:tcW w:type="dxa" w:w="4876"/>
+            <w:tcW w:type="dxa" w:w="3289"/>
           </w:tcPr>
           <w:p>
             <w:pPr>
-              <w:spacing w:after="120"/>
+              <w:spacing w:after="100"/>
             </w:pPr>
             <w:r>
               <w:rPr>
-                <w:sz w:val="19"/>
+                <w:sz w:val="18"/>
               </w:rPr>
-              <w:t>Semanas 1 y 2</w:t>
+              <w:t>40 %</w:t>
             </w:r>
           </w:p>
         </w:tc>
         <w:tc>
           <w:tcPr>
-            <w:tcW w:type="dxa" w:w="4876"/>
+            <w:tcW w:type="dxa" w:w="3289"/>
           </w:tcPr>
           <w:p>
             <w:pPr>
-              <w:spacing w:after="120"/>
+              <w:spacing w:after="100"/>
             </w:pPr>
             <w:r>
               <w:rPr>
-                <w:sz w:val="19"/>
+                <w:sz w:val="18"/>
               </w:rPr>
-              <w:t>Levantamiento detallado de requerimientos, diseño de la base de datos y desarrollo del expediente de personal.</w:t>
+              <w:t>S/ 1,400.00</w:t>
+            </w:r>
+          </w:p>
+        </w:tc>
+        <w:tc>
+          <w:tcPr>
+            <w:tcW w:type="dxa" w:w="3289"/>
+          </w:tcPr>
+          <w:p>
+            <w:pPr>
+              <w:spacing w:after="100"/>
+            </w:pPr>
+            <w:r>
+              <w:rPr>
+                <w:sz w:val="18"/>
+              </w:rPr>
+              <w:t>Aceptación de la propuesta e inicio del proyecto.</w:t>
             </w:r>
           </w:p>
         </w:tc>
@@ -376,33 +578,49 @@
         </w:trPr>
         <w:tc>
           <w:tcPr>
-            <w:tcW w:type="dxa" w:w="4876"/>
+            <w:tcW w:type="dxa" w:w="3289"/>
           </w:tcPr>
           <w:p>
             <w:pPr>
-              <w:spacing w:after="120"/>
+              <w:spacing w:after="100"/>
             </w:pPr>
             <w:r>
               <w:rPr>
-                <w:sz w:val="19"/>
+                <w:sz w:val="18"/>
               </w:rPr>
-              <w:t>Semanas 3 y 4</w:t>
+              <w:t>30 %</w:t>
             </w:r>
           </w:p>
         </w:tc>
         <w:tc>
           <w:tcPr>
-            <w:tcW w:type="dxa" w:w="4876"/>
+            <w:tcW w:type="dxa" w:w="3289"/>
           </w:tcPr>
           <w:p>
             <w:pPr>
-              <w:spacing w:after="120"/>
+              <w:spacing w:after="100"/>
             </w:pPr>
             <w:r>
               <w:rPr>
-                <w:sz w:val="19"/>
+                <w:sz w:val="18"/>
               </w:rPr>
-              <w:t>Desarrollo de asistencia, vacaciones y lógica de planilla con generación de reportes.</w:t>
+              <w:t>S/ 1,050.00</w:t>
+            </w:r>
+          </w:p>
+        </w:tc>
+        <w:tc>
+          <w:tcPr>
+            <w:tcW w:type="dxa" w:w="3289"/>
+          </w:tcPr>
+          <w:p>
+            <w:pPr>
+              <w:spacing w:after="100"/>
+            </w:pPr>
+            <w:r>
+              <w:rPr>
+                <w:sz w:val="18"/>
+              </w:rPr>
+              <w:t>Presentación funcional de Personal, Asistencias y Planilla.</w:t>
             </w:r>
           </w:p>
         </w:tc>
@@ -413,70 +631,49 @@
         </w:trPr>
         <w:tc>
           <w:tcPr>
-            <w:tcW w:type="dxa" w:w="4876"/>
+            <w:tcW w:type="dxa" w:w="3289"/>
           </w:tcPr>
           <w:p>
             <w:pPr>
-              <w:spacing w:after="120"/>
+              <w:spacing w:after="100"/>
             </w:pPr>
             <w:r>
               <w:rPr>
-                <w:sz w:val="19"/>
+                <w:sz w:val="18"/>
               </w:rPr>
-              <w:t>Semana 5</w:t>
+              <w:t>30 %</w:t>
             </w:r>
           </w:p>
         </w:tc>
         <w:tc>
           <w:tcPr>
-            <w:tcW w:type="dxa" w:w="4876"/>
+            <w:tcW w:type="dxa" w:w="3289"/>
           </w:tcPr>
           <w:p>
             <w:pPr>
-              <w:spacing w:after="120"/>
+              <w:spacing w:after="100"/>
             </w:pPr>
             <w:r>
               <w:rPr>
-                <w:sz w:val="19"/>
+                <w:sz w:val="18"/>
               </w:rPr>
-              <w:t>Integración de firma táctil, encuestas y comunicación interna; pruebas de flujo.</w:t>
-            </w:r>
-          </w:p>
-        </w:tc>
-      </w:tr>
-      <w:tr>
-        <w:trPr>
-          <w:cantSplit/>
-        </w:trPr>
-        <w:tc>
-          <w:tcPr>
-            <w:tcW w:type="dxa" w:w="4876"/>
-          </w:tcPr>
-          <w:p>
-            <w:pPr>
-              <w:spacing w:after="120"/>
-            </w:pPr>
-            <w:r>
-              <w:rPr>
-                <w:sz w:val="19"/>
-              </w:rPr>
-              <w:t>Semana 6</w:t>
+              <w:t>S/ 1,050.00</w:t>
             </w:r>
           </w:p>
         </w:tc>
         <w:tc>
           <w:tcPr>
-            <w:tcW w:type="dxa" w:w="4876"/>
+            <w:tcW w:type="dxa" w:w="3289"/>
           </w:tcPr>
           <w:p>
             <w:pPr>
-              <w:spacing w:after="120"/>
+              <w:spacing w:after="100"/>
             </w:pPr>
             <w:r>
               <w:rPr>
-                <w:sz w:val="19"/>
+                <w:sz w:val="18"/>
               </w:rPr>
-              <w:t>Pruebas integrales de calidad, despliegue en producción y capacitación al personal.</w:t>
+              <w:t>Sistema instalado y probado, con la capacitación finalizada.</w:t>
             </w:r>
           </w:p>
         </w:tc>
@@ -487,7 +684,7 @@
         <w:pStyle w:val="Heading2"/>
       </w:pPr>
       <w:r>
-        <w:t>Entregables</w:t>
+        <w:t>Qué entregamos</w:t>
       </w:r>
     </w:p>
     <w:p>
@@ -495,7 +692,7 @@
         <w:pStyle w:val="ListBullet"/>
       </w:pPr>
       <w:r>
-        <w:t>Plataforma web en producción, configurada y funcional conforme al alcance acordado.</w:t>
+        <w:t>Plataforma web configurada y funcionando en el servidor de producción.</w:t>
       </w:r>
     </w:p>
     <w:p>
@@ -511,7 +708,7 @@
         <w:pStyle w:val="ListBullet"/>
       </w:pPr>
       <w:r>
-        <w:t>Sesión de capacitación para el equipo administrador y colaboradores.</w:t>
+        <w:t>Capacitación para el equipo administrador y los colaboradores.</w:t>
       </w:r>
     </w:p>
     <w:p>
@@ -519,12 +716,12 @@
         <w:pStyle w:val="Heading2"/>
       </w:pPr>
       <w:r>
-        <w:t>Garantía posterior a la entrega</w:t>
+        <w:t>Alojamiento y alcance técnico</w:t>
       </w:r>
     </w:p>
     <w:p>
       <w:r>
-        <w:t>Se brindarán 60 días calendario desde la puesta en marcha para corregir incidencias o errores del desarrollo sin costo adicional, dentro del alcance contratado.</w:t>
+        <w:t>MARKINT asumirá directamente el costo del VPS y la infraestructura cloud. La instalación del sistema en ese servidor forma parte del servicio. La plataforma se adaptará a computadoras, tabletas y teléfonos; no se incluye una aplicación móvil nativa ni conexión directa con relojes biométricos físicos.</w:t>
       </w:r>
     </w:p>
     <w:p>
@@ -532,12 +729,12 @@
         <w:pStyle w:val="Heading2"/>
       </w:pPr>
       <w:r>
-        <w:t>Alcance de la plataforma</w:t>
+        <w:t>Inicio y validación del trabajo</w:t>
       </w:r>
     </w:p>
     <w:p>
       <w:r>
-        <w:t>La plataforma web será adaptable a computadoras, tabletas y teléfonos. El proyecto no incluye integración directa con relojes biométricos físicos ni el desarrollo de una aplicación móvil nativa.</w:t>
+        <w:t>El plazo comienza con la aceptación, el pago inicial y la entrega de la información y los accesos necesarios. MARKINT designará a una persona para coordinar las revisiones y validar las reglas de cálculo, los flujos y los archivos bancarios. Si cambian los requerimientos o se retrasa la información, se revisará el efecto en el plazo antes de continuar con el trabajo afectado.</w:t>
       </w:r>
     </w:p>
     <w:p>
@@ -545,25 +742,12 @@
         <w:pStyle w:val="Heading2"/>
       </w:pPr>
       <w:r>
-        <w:t>Alojamiento e infraestructura</w:t>
+        <w:t>Garantía</w:t>
       </w:r>
     </w:p>
     <w:p>
       <w:r>
-        <w:t>El costo del servidor de alojamiento web (VPS) y de la infraestructura cloud será asumido directamente por MARKINT. El despliegue del sistema en el servidor de producción forma parte del servicio de implementación.</w:t>
-      </w:r>
-    </w:p>
-    <w:p>
-      <w:r>
-        <w:br w:type="page"/>
-      </w:r>
-    </w:p>
-    <w:p>
-      <w:pPr>
-        <w:pStyle w:val="Heading1"/>
-      </w:pPr>
-      <w:r>
-        <w:t>Propuesta económica</w:t>
+        <w:t>Durante los 60 días calendario siguientes a la puesta en marcha corregiremos, sin costo adicional, las incidencias del desarrollo que correspondan al alcance contratado.</w:t>
       </w:r>
     </w:p>
     <w:p>
@@ -571,314 +755,24 @@
         <w:pStyle w:val="Heading2"/>
       </w:pPr>
       <w:r>
-        <w:t>Inversión total del desarrollo</w:t>
+        <w:t>Validez</w:t>
       </w:r>
     </w:p>
     <w:p>
       <w:r>
-        <w:rPr>
-          <w:b/>
-          <w:color w:val="08A6BB"/>
-          <w:sz w:val="60"/>
-        </w:rPr>
-        <w:t>S/ 3,500.00 PEN</w:t>
+        <w:t>Esta propuesta tiene una validez de 15 días calendario desde su emisión, el 22 de octubre de 2026.</w:t>
       </w:r>
     </w:p>
     <w:p>
       <w:r>
-        <w:t>Monto fijo por el desarrollo a medida descrito en esta propuesta, sin cobro por colaborador.</w:t>
-      </w:r>
-    </w:p>
-    <w:p>
-      <w:pPr>
-        <w:pStyle w:val="Heading2"/>
-      </w:pPr>
-      <w:r>
-        <w:t>Esquema de pagos por hitos</w:t>
-      </w:r>
-    </w:p>
-    <w:tbl>
-      <w:tblPr>
-        <w:tblStyle w:val="LightShading-Accent1"/>
-        <w:tblW w:type="auto" w:w="0"/>
-        <w:tblLook w:firstColumn="1" w:firstRow="1" w:lastColumn="0" w:lastRow="0" w:noHBand="0" w:noVBand="1" w:val="04A0"/>
-      </w:tblPr>
-      <w:tblGrid>
-        <w:gridCol w:w="3251"/>
-        <w:gridCol w:w="3251"/>
-        <w:gridCol w:w="3251"/>
-      </w:tblGrid>
-      <w:tr>
-        <w:trPr>
-          <w:cantSplit/>
-        </w:trPr>
-        <w:tc>
-          <w:tcPr>
-            <w:tcW w:type="dxa" w:w="3251"/>
-            <w:shd w:fill="10283F"/>
-          </w:tcPr>
-          <w:p>
-            <w:pPr>
-              <w:spacing w:after="120"/>
-            </w:pPr>
-            <w:r>
-              <w:rPr>
-                <w:b/>
-                <w:color w:val="FFFFFF"/>
-                <w:sz w:val="19"/>
-              </w:rPr>
-              <w:t>Pago</w:t>
-            </w:r>
-          </w:p>
-        </w:tc>
-        <w:tc>
-          <w:tcPr>
-            <w:tcW w:type="dxa" w:w="3251"/>
-            <w:shd w:fill="10283F"/>
-          </w:tcPr>
-          <w:p>
-            <w:pPr>
-              <w:spacing w:after="120"/>
-            </w:pPr>
-            <w:r>
-              <w:rPr>
-                <w:b/>
-                <w:color w:val="FFFFFF"/>
-                <w:sz w:val="19"/>
-              </w:rPr>
-              <w:t>Importe</w:t>
-            </w:r>
-          </w:p>
-        </w:tc>
-        <w:tc>
-          <w:tcPr>
-            <w:tcW w:type="dxa" w:w="3251"/>
-            <w:shd w:fill="10283F"/>
-          </w:tcPr>
-          <w:p>
-            <w:pPr>
-              <w:spacing w:after="120"/>
-            </w:pPr>
-            <w:r>
-              <w:rPr>
-                <w:b/>
-                <w:color w:val="FFFFFF"/>
-                <w:sz w:val="19"/>
-              </w:rPr>
-              <w:t>Condición</w:t>
-            </w:r>
-          </w:p>
-        </w:tc>
-      </w:tr>
-      <w:tr>
-        <w:trPr>
-          <w:cantSplit/>
-        </w:trPr>
-        <w:tc>
-          <w:tcPr>
-            <w:tcW w:type="dxa" w:w="3251"/>
-          </w:tcPr>
-          <w:p>
-            <w:pPr>
-              <w:spacing w:after="120"/>
-            </w:pPr>
-            <w:r>
-              <w:rPr>
-                <w:sz w:val="19"/>
-              </w:rPr>
-              <w:t>40 %</w:t>
-            </w:r>
-          </w:p>
-        </w:tc>
-        <w:tc>
-          <w:tcPr>
-            <w:tcW w:type="dxa" w:w="3251"/>
-          </w:tcPr>
-          <w:p>
-            <w:pPr>
-              <w:spacing w:after="120"/>
-            </w:pPr>
-            <w:r>
-              <w:rPr>
-                <w:sz w:val="19"/>
-              </w:rPr>
-              <w:t>S/ 1,400.00</w:t>
-            </w:r>
-          </w:p>
-        </w:tc>
-        <w:tc>
-          <w:tcPr>
-            <w:tcW w:type="dxa" w:w="3251"/>
-          </w:tcPr>
-          <w:p>
-            <w:pPr>
-              <w:spacing w:after="120"/>
-            </w:pPr>
-            <w:r>
-              <w:rPr>
-                <w:sz w:val="19"/>
-              </w:rPr>
-              <w:t>A la aceptación de la propuesta y reunión de inicio del proyecto.</w:t>
-            </w:r>
-          </w:p>
-        </w:tc>
-      </w:tr>
-      <w:tr>
-        <w:trPr>
-          <w:cantSplit/>
-        </w:trPr>
-        <w:tc>
-          <w:tcPr>
-            <w:tcW w:type="dxa" w:w="3251"/>
-          </w:tcPr>
-          <w:p>
-            <w:pPr>
-              <w:spacing w:after="120"/>
-            </w:pPr>
-            <w:r>
-              <w:rPr>
-                <w:sz w:val="19"/>
-              </w:rPr>
-              <w:t>30 %</w:t>
-            </w:r>
-          </w:p>
-        </w:tc>
-        <w:tc>
-          <w:tcPr>
-            <w:tcW w:type="dxa" w:w="3251"/>
-          </w:tcPr>
-          <w:p>
-            <w:pPr>
-              <w:spacing w:after="120"/>
-            </w:pPr>
-            <w:r>
-              <w:rPr>
-                <w:sz w:val="19"/>
-              </w:rPr>
-              <w:t>S/ 1,050.00</w:t>
-            </w:r>
-          </w:p>
-        </w:tc>
-        <w:tc>
-          <w:tcPr>
-            <w:tcW w:type="dxa" w:w="3251"/>
-          </w:tcPr>
-          <w:p>
-            <w:pPr>
-              <w:spacing w:after="120"/>
-            </w:pPr>
-            <w:r>
-              <w:rPr>
-                <w:sz w:val="19"/>
-              </w:rPr>
-              <w:t>A la presentación del avance funcional de Personal, Asistencias y Planilla.</w:t>
-            </w:r>
-          </w:p>
-        </w:tc>
-      </w:tr>
-      <w:tr>
-        <w:trPr>
-          <w:cantSplit/>
-        </w:trPr>
-        <w:tc>
-          <w:tcPr>
-            <w:tcW w:type="dxa" w:w="3251"/>
-          </w:tcPr>
-          <w:p>
-            <w:pPr>
-              <w:spacing w:after="120"/>
-            </w:pPr>
-            <w:r>
-              <w:rPr>
-                <w:sz w:val="19"/>
-              </w:rPr>
-              <w:t>30 %</w:t>
-            </w:r>
-          </w:p>
-        </w:tc>
-        <w:tc>
-          <w:tcPr>
-            <w:tcW w:type="dxa" w:w="3251"/>
-          </w:tcPr>
-          <w:p>
-            <w:pPr>
-              <w:spacing w:after="120"/>
-            </w:pPr>
-            <w:r>
-              <w:rPr>
-                <w:sz w:val="19"/>
-              </w:rPr>
-              <w:t>S/ 1,050.00</w:t>
-            </w:r>
-          </w:p>
-        </w:tc>
-        <w:tc>
-          <w:tcPr>
-            <w:tcW w:type="dxa" w:w="3251"/>
-          </w:tcPr>
-          <w:p>
-            <w:pPr>
-              <w:spacing w:after="120"/>
-            </w:pPr>
-            <w:r>
-              <w:rPr>
-                <w:sz w:val="19"/>
-              </w:rPr>
-              <w:t>Contra entrega del sistema desplegado, probado y con capacitación finalizada.</w:t>
-            </w:r>
-          </w:p>
-        </w:tc>
-      </w:tr>
-    </w:tbl>
-    <w:p>
-      <w:pPr>
-        <w:pStyle w:val="Heading2"/>
-      </w:pPr>
-      <w:r>
-        <w:t>Coordinación e inicio del proyecto</w:t>
-      </w:r>
-    </w:p>
-    <w:p>
-      <w:r>
-        <w:t>El plazo se cuenta desde la aceptación de la propuesta, el pago inicial y la entrega de la información y accesos necesarios. MARKINT designará un representante para validar las reglas de cálculo, los archivos bancarios, los flujos de aprobación y los avances funcionales.</w:t>
-      </w:r>
-    </w:p>
-    <w:p>
-      <w:r>
-        <w:t>Los datos y las reglas de planilla se revisarán con el responsable contable antes de su uso en producción. Las modificaciones al alcance o los retrasos en información y validaciones se acordarán considerando su efecto en el plazo.</w:t>
-      </w:r>
-    </w:p>
-    <w:p>
-      <w:pPr>
-        <w:pStyle w:val="Heading2"/>
-      </w:pPr>
-      <w:r>
-        <w:t>Validez de la propuesta</w:t>
-      </w:r>
-    </w:p>
-    <w:p>
-      <w:r>
-        <w:t>15 días calendario a partir de la fecha de emisión: 22 de octubre de 2026.</w:t>
-      </w:r>
-    </w:p>
-    <w:p>
-      <w:pPr>
-        <w:pStyle w:val="Heading2"/>
-      </w:pPr>
-      <w:r>
         <w:t>Safe Zone Perú</w:t>
-      </w:r>
-    </w:p>
-    <w:p>
-      <w:r>
-        <w:t>Desarrollo de soluciones tecnológicas a medida para la gestión de su organización.</w:t>
       </w:r>
     </w:p>
     <w:sectPr>
       <w:headerReference w:type="default" r:id="rId9"/>
       <w:footerReference w:type="default" r:id="rId10"/>
       <w:pgSz w:w="11906" w:h="16838"/>
-      <w:pgMar w:top="935" w:right="1077" w:bottom="907" w:left="1077" w:header="720" w:footer="720" w:gutter="0"/>
+      <w:pgMar w:top="850" w:right="1020" w:bottom="822" w:left="1020" w:header="720" w:footer="720" w:gutter="0"/>
       <w:cols w:space="720"/>
       <w:docGrid w:linePitch="360"/>
     </w:sectPr>
@@ -894,10 +788,10 @@
     </w:pPr>
     <w:r>
       <w:rPr>
-        <w:color w:val="51697D"/>
+        <w:color w:val="536673"/>
         <w:sz w:val="16"/>
       </w:rPr>
-      <w:t xml:space="preserve">Safe Zone Perú  ·  22 de octubre de 2026                                          </w:t>
+      <w:t xml:space="preserve">Propuesta de desarrollo · 22 de octubre de 2026                                       </w:t>
     </w:r>
     <w:fldSimple w:instr="PAGE"/>
   </w:p>
@@ -912,10 +806,10 @@
     </w:pPr>
     <w:r>
       <w:rPr>
-        <w:color w:val="51697D"/>
+        <w:color w:val="536673"/>
         <w:sz w:val="16"/>
       </w:rPr>
-      <w:t>SAFE ZONE PERÚ                                             MARKINT / PROPUESTA</w:t>
+      <w:t>SAFE ZONE PERÚ                                                       MARKINT</w:t>
     </w:r>
   </w:p>
 </w:hdr>
@@ -1289,7 +1183,7 @@
     </w:pPr>
     <w:rPr>
       <w:rFonts w:ascii="DejaVu Sans" w:hAnsi="DejaVu Sans"/>
-      <w:color w:val="173149"/>
+      <w:color w:val="183347"/>
       <w:sz w:val="20"/>
     </w:rPr>
   </w:style>
@@ -1348,15 +1242,15 @@
     <w:pPr>
       <w:keepNext/>
       <w:keepLines/>
-      <w:spacing w:before="200" w:after="120"/>
+      <w:spacing w:before="220" w:after="100"/>
       <w:outlineLvl w:val="0"/>
     </w:pPr>
     <w:rPr>
       <w:rFonts w:asciiTheme="majorHAnsi" w:eastAsiaTheme="majorEastAsia" w:hAnsiTheme="majorHAnsi" w:cstheme="majorBidi" w:ascii="DejaVu Sans" w:hAnsi="DejaVu Sans"/>
       <w:b/>
       <w:bCs/>
-      <w:color w:val="10283F"/>
-      <w:sz w:val="42"/>
+      <w:color w:val="183347"/>
+      <w:sz w:val="40"/>
       <w:szCs w:val="28"/>
     </w:rPr>
   </w:style>
@@ -1372,14 +1266,14 @@
     <w:pPr>
       <w:keepNext/>
       <w:keepLines/>
-      <w:spacing w:before="200" w:after="120"/>
+      <w:spacing w:before="220" w:after="100"/>
       <w:outlineLvl w:val="1"/>
     </w:pPr>
     <w:rPr>
       <w:rFonts w:asciiTheme="majorHAnsi" w:eastAsiaTheme="majorEastAsia" w:hAnsiTheme="majorHAnsi" w:cstheme="majorBidi" w:ascii="DejaVu Sans" w:hAnsi="DejaVu Sans"/>
       <w:b/>
       <w:bCs/>
-      <w:color w:val="08A6BB"/>
+      <w:color w:val="078B9E"/>
       <w:sz w:val="24"/>
       <w:szCs w:val="26"/>
     </w:rPr>
@@ -1637,15 +1531,15 @@
       <w:pBdr>
         <w:bottom w:val="single" w:sz="8" w:space="4" w:color="4F81BD" w:themeColor="accent1"/>
       </w:pBdr>
-      <w:spacing w:after="120" w:line="240" w:lineRule="auto" w:before="200"/>
+      <w:spacing w:after="100" w:line="240" w:lineRule="auto" w:before="220"/>
       <w:contextualSpacing/>
     </w:pPr>
     <w:rPr>
       <w:rFonts w:asciiTheme="majorHAnsi" w:eastAsiaTheme="majorEastAsia" w:hAnsiTheme="majorHAnsi" w:cstheme="majorBidi" w:ascii="DejaVu Sans" w:hAnsi="DejaVu Sans"/>
-      <w:color w:val="10283F"/>
+      <w:color w:val="183347"/>
       <w:spacing w:val="5"/>
       <w:kern w:val="28"/>
-      <w:sz w:val="58"/>
+      <w:sz w:val="50"/>
       <w:szCs w:val="52"/>
     </w:rPr>
   </w:style>
@@ -1676,15 +1570,14 @@
       <w:numPr>
         <w:ilvl w:val="1"/>
       </w:numPr>
-      <w:spacing w:before="200" w:after="120"/>
     </w:pPr>
     <w:rPr>
-      <w:rFonts w:asciiTheme="majorHAnsi" w:eastAsiaTheme="majorEastAsia" w:hAnsiTheme="majorHAnsi" w:cstheme="majorBidi" w:ascii="DejaVu Sans" w:hAnsi="DejaVu Sans"/>
+      <w:rFonts w:asciiTheme="majorHAnsi" w:eastAsiaTheme="majorEastAsia" w:hAnsiTheme="majorHAnsi" w:cstheme="majorBidi"/>
       <w:i/>
       <w:iCs/>
-      <w:color w:val="10283F"/>
+      <w:color w:val="4F81BD" w:themeColor="accent1"/>
       <w:spacing w:val="15"/>
-      <w:sz w:val="26"/>
+      <w:sz w:val="24"/>
       <w:szCs w:val="24"/>
     </w:rPr>
   </w:style>

</xml_diff>